<commit_message>
Publish Aramco study with Figure D-1 divergence graph (new docx+PDF); bump tokens
</commit_message>
<xml_diff>
--- a/files/Aramco_Valuation_Study_01-07-2026_public.docx
+++ b/files/Aramco_Valuation_Study_01-07-2026_public.docx
@@ -15000,6 +15000,61 @@
           <w:sz w:val="24"/>
         </w:rPr>
         <w:t>D.6  Reading the divergence</w:t>
+      </w:r>
+    </w:p>
+    <w:p>
+      <w:pPr>
+        <w:spacing w:before="80" w:after="40"/>
+        <w:jc w:val="center"/>
+      </w:pPr>
+      <w:r>
+        <w:drawing>
+          <wp:inline xmlns:a="http://schemas.openxmlformats.org/drawingml/2006/main" xmlns:pic="http://schemas.openxmlformats.org/drawingml/2006/picture">
+            <wp:extent cx="6035040" cy="2058916"/>
+            <wp:docPr id="6" name="Picture 6"/>
+            <wp:cNvGraphicFramePr>
+              <a:graphicFrameLocks noChangeAspect="1"/>
+            </wp:cNvGraphicFramePr>
+            <a:graphic>
+              <a:graphicData uri="http://schemas.openxmlformats.org/drawingml/2006/picture">
+                <pic:pic>
+                  <pic:nvPicPr>
+                    <pic:cNvPr id="0" name="fig_D1_divergence.png"/>
+                    <pic:cNvPicPr/>
+                  </pic:nvPicPr>
+                  <pic:blipFill>
+                    <a:blip r:embed="rId14"/>
+                    <a:stretch>
+                      <a:fillRect/>
+                    </a:stretch>
+                  </pic:blipFill>
+                  <pic:spPr>
+                    <a:xfrm>
+                      <a:off x="0" y="0"/>
+                      <a:ext cx="6035040" cy="2058916"/>
+                    </a:xfrm>
+                    <a:prstGeom prst="rect"/>
+                  </pic:spPr>
+                </pic:pic>
+              </a:graphicData>
+            </a:graphic>
+          </wp:inline>
+        </w:drawing>
+      </w:r>
+    </w:p>
+    <w:p>
+      <w:pPr>
+        <w:spacing w:before="40" w:after="200"/>
+      </w:pPr>
+      <w:r>
+        <w:rPr>
+          <w:rFonts w:ascii="Calibri" w:hAnsi="Calibri"/>
+          <w:b w:val="0"/>
+          <w:i/>
+          <w:color w:val="666666"/>
+          <w:sz w:val="17"/>
+        </w:rPr>
+        <w:t>Figure D-1 · The three experts' fair-value ranges. Brass ticks are base cases; the gold band is the panel centre; the dark line is spot. The spread is almost entirely one disagreement: how much of the low-cost reserve base reaches the minority shareholder after the state's royalty, tax and priority claim.</w:t>
       </w:r>
     </w:p>
     <w:tbl>

</xml_diff>